<commit_message>
feat(web): TinyMCE 替换为 WangEditor，修复多项问题
主要变更：
1. 富文本编辑器：TinyMCE → WangEditor（MIT 协议，完全免费）
2. 核心字段同步：改为保存时自动同步，支持创建自定义字段
3. 文档渲染：修复标题级别、添加章节序号（2.1.1、2.1.2...）
4. Bug 修复：
   - YAML 预览报错（数字键导致排序失败）
   - task_name 非必填，修复多 Sheet 解析失败问题

修改文件：
- src/web/templates/base.html: CDN 替换
- src/web/templates/partials/actions.html: WangEditor 集成
- src/web/templates/partials/columns.html: 自动同步逻辑
- src/web/services/config_service.py: _stringify_keys、同步增强
- src/renderer/template_renderer.py: 标题级别和序号修复
- config/rules.yaml: core_fields 配置更新

Co-Authored-By: Claude Opus 4.6 <noreply@anthropic.com>
</commit_message>
<xml_diff>
--- a/templates/template.docx
+++ b/templates/template.docx
@@ -86,58 +86,29 @@
       </w:r>
     </w:p>
     <w:p>
-      <w:r>
-        <w:t>{% if summary.has_external_links %}• 参考链接：{% endif %}</w:t>
-      </w:r>
+      <w:r/>
     </w:p>
     <w:p>
-      <w:r>
-        <w:t>{% for link in summary.external_links %}  - {{ link }}</w:t>
-        <w:br/>
-        <w:t>{% endfor %}</w:t>
-      </w:r>
+      <w:r/>
     </w:p>
     <w:p/>
     <w:p>
-      <w:r>
-        <w:t>{%p if has_risk_alerts %}</w:t>
-      </w:r>
-      <w:r>
-        <w:t>⚠️ 高危操作告警</w:t>
-      </w:r>
+      <w:r/>
     </w:p>
     <w:p>
-      <w:r>
-        <w:t>{%p for alert in risk_alerts %}</w:t>
-      </w:r>
+      <w:r/>
     </w:p>
     <w:p>
-      <w:r>
-        <w:rPr>
-          <w:b/>
-        </w:rPr>
-        <w:t>【{{ alert.sheet_name }}】{{ alert.action_type }}</w:t>
-      </w:r>
-      <w:r>
-        <w:t xml:space="preserve"> - 共 {{ alert.task_count }} 个任务</w:t>
-      </w:r>
+      <w:r/>
     </w:p>
     <w:p>
-      <w:r>
-        <w:t>{% for task_name in alert.task_names %}  • {{ task_name }}</w:t>
-        <w:br/>
-        <w:t>{% endfor %}</w:t>
-      </w:r>
+      <w:r/>
     </w:p>
     <w:p>
-      <w:r>
-        <w:t>{%p endfor %}</w:t>
-      </w:r>
+      <w:r/>
     </w:p>
     <w:p>
-      <w:r>
-        <w:t>{%p endif %}</w:t>
-      </w:r>
+      <w:r/>
     </w:p>
     <w:p/>
     <w:p>
@@ -149,9 +120,7 @@
       </w:r>
     </w:p>
     <w:p>
-      <w:r>
-        <w:t>{%p if implementation_summary.has_data %}</w:t>
-      </w:r>
+      <w:r/>
     </w:p>
     <w:tbl>
       <w:tblPr>
@@ -360,14 +329,12 @@
       </w:tr>
     </w:tbl>
     <w:p>
-      <w:r>
-        <w:t>{%p endif %}</w:t>
-      </w:r>
+      <w:r/>
     </w:p>
     <w:p/>
     <w:p>
       <w:pPr>
-        <w:pStyle w:val="Heading2"/>
+        <w:pStyle w:val="Heading3"/>
       </w:pPr>
       <w:r>
         <w:t>2.1 详细实施步骤</w:t>
@@ -380,7 +347,7 @@
     </w:p>
     <w:p>
       <w:pPr>
-        <w:pStyle w:val="Heading3"/>
+        <w:pStyle w:val="Heading4"/>
       </w:pPr>
       <w:r>
         <w:t>2.1.{{ loop.index }} {{ section.section_name }}</w:t>
@@ -392,9 +359,7 @@
       </w:r>
     </w:p>
     <w:p>
-      <w:pPr>
-        <w:pStyle w:val="Heading2"/>
-      </w:pPr>
+      <w:pPr/>
       <w:r>
         <w:t>{{ action_group.action_type }}</w:t>
       </w:r>

</xml_diff>